<commit_message>
feat(docs): adicionar informações detalhadas sobre colunas do conjunto de dados
</commit_message>
<xml_diff>
--- a/Fase 1 - Ciência de Dados e Inteligência Artificial.docx
+++ b/Fase 1 - Ciência de Dados e Inteligência Artificial.docx
@@ -608,7 +608,11 @@
         <w:spacing w:after="60"/>
         <w:jc w:val="both"/>
         <w:rPr>
+          <w:rStyle w:val="normaltextrun"/>
+          <w:rFonts w:asciiTheme="minorHAnsi" w:hAnsiTheme="minorHAnsi" w:cstheme="minorBidi"/>
           <w:color w:val="767171" w:themeColor="background2" w:themeShade="80"/>
+          <w:sz w:val="20"/>
+          <w:szCs w:val="20"/>
         </w:rPr>
       </w:pPr>
       <w:r>
@@ -712,6 +716,1295 @@
     </w:p>
     <w:p>
       <w:pPr>
+        <w:pStyle w:val="PargrafodaLista"/>
+        <w:numPr>
+          <w:ilvl w:val="0"/>
+          <w:numId w:val="3"/>
+        </w:numPr>
+        <w:spacing w:after="0" w:line="240" w:lineRule="auto"/>
+        <w:rPr>
+          <w:color w:val="000000" w:themeColor="text1"/>
+        </w:rPr>
+        <w:sectPr>
+          <w:headerReference w:type="default" r:id="rId11"/>
+          <w:footerReference w:type="default" r:id="rId12"/>
+          <w:pgSz w:w="11906" w:h="16838"/>
+          <w:pgMar w:top="1418" w:right="1418" w:bottom="1418" w:left="1418" w:header="709" w:footer="794" w:gutter="0"/>
+          <w:cols w:space="708"/>
+          <w:docGrid w:linePitch="360"/>
+        </w:sectPr>
+      </w:pPr>
+    </w:p>
+    <w:p>
+      <w:pPr>
+        <w:pStyle w:val="PargrafodaLista"/>
+        <w:numPr>
+          <w:ilvl w:val="0"/>
+          <w:numId w:val="3"/>
+        </w:numPr>
+        <w:spacing w:after="0" w:line="240" w:lineRule="auto"/>
+        <w:rPr>
+          <w:color w:val="000000" w:themeColor="text1"/>
+        </w:rPr>
+      </w:pPr>
+      <w:r>
+        <w:rPr>
+          <w:color w:val="000000" w:themeColor="text1"/>
+        </w:rPr>
+        <w:lastRenderedPageBreak/>
+        <w:t>SIT (coluna alvo):</w:t>
+      </w:r>
+    </w:p>
+    <w:p>
+      <w:pPr>
+        <w:pStyle w:val="PargrafodaLista"/>
+        <w:numPr>
+          <w:ilvl w:val="1"/>
+          <w:numId w:val="3"/>
+        </w:numPr>
+        <w:spacing w:after="0" w:line="240" w:lineRule="auto"/>
+        <w:rPr>
+          <w:color w:val="000000" w:themeColor="text1"/>
+        </w:rPr>
+      </w:pPr>
+      <w:r>
+        <w:rPr>
+          <w:color w:val="000000" w:themeColor="text1"/>
+        </w:rPr>
+        <w:t>Representa: Situação cadastral da companhia</w:t>
+      </w:r>
+    </w:p>
+    <w:p>
+      <w:pPr>
+        <w:pStyle w:val="PargrafodaLista"/>
+        <w:numPr>
+          <w:ilvl w:val="1"/>
+          <w:numId w:val="3"/>
+        </w:numPr>
+        <w:spacing w:after="0" w:line="240" w:lineRule="auto"/>
+        <w:rPr>
+          <w:color w:val="000000" w:themeColor="text1"/>
+        </w:rPr>
+      </w:pPr>
+      <w:r>
+        <w:rPr>
+          <w:color w:val="000000" w:themeColor="text1"/>
+        </w:rPr>
+        <w:t xml:space="preserve">Tipo: </w:t>
+      </w:r>
+      <w:r>
+        <w:rPr>
+          <w:color w:val="000000" w:themeColor="text1"/>
+        </w:rPr>
+        <w:t>Categórico</w:t>
+      </w:r>
+    </w:p>
+    <w:p>
+      <w:pPr>
+        <w:pStyle w:val="PargrafodaLista"/>
+        <w:numPr>
+          <w:ilvl w:val="1"/>
+          <w:numId w:val="3"/>
+        </w:numPr>
+        <w:spacing w:after="0" w:line="240" w:lineRule="auto"/>
+        <w:rPr>
+          <w:color w:val="000000" w:themeColor="text1"/>
+        </w:rPr>
+      </w:pPr>
+      <w:r>
+        <w:rPr>
+          <w:color w:val="000000" w:themeColor="text1"/>
+        </w:rPr>
+        <w:t>Valores válidos: ATIVO, CANCELADA, SUSPENSO(A) - DECISÃO ADM</w:t>
+      </w:r>
+    </w:p>
+    <w:p>
+      <w:pPr>
+        <w:pStyle w:val="PargrafodaLista"/>
+        <w:numPr>
+          <w:ilvl w:val="0"/>
+          <w:numId w:val="3"/>
+        </w:numPr>
+        <w:spacing w:after="0" w:line="240" w:lineRule="auto"/>
+        <w:rPr>
+          <w:color w:val="000000" w:themeColor="text1"/>
+        </w:rPr>
+      </w:pPr>
+      <w:r>
+        <w:rPr>
+          <w:color w:val="000000" w:themeColor="text1"/>
+        </w:rPr>
+        <w:t>CNPJ_CIA:</w:t>
+      </w:r>
+    </w:p>
+    <w:p>
+      <w:pPr>
+        <w:pStyle w:val="PargrafodaLista"/>
+        <w:numPr>
+          <w:ilvl w:val="1"/>
+          <w:numId w:val="3"/>
+        </w:numPr>
+        <w:spacing w:after="0" w:line="240" w:lineRule="auto"/>
+        <w:rPr>
+          <w:color w:val="000000" w:themeColor="text1"/>
+        </w:rPr>
+      </w:pPr>
+      <w:r>
+        <w:rPr>
+          <w:color w:val="000000" w:themeColor="text1"/>
+        </w:rPr>
+        <w:t>Representa: CNPJ da companhia</w:t>
+      </w:r>
+    </w:p>
+    <w:p>
+      <w:pPr>
+        <w:pStyle w:val="PargrafodaLista"/>
+        <w:numPr>
+          <w:ilvl w:val="1"/>
+          <w:numId w:val="3"/>
+        </w:numPr>
+        <w:spacing w:after="0" w:line="240" w:lineRule="auto"/>
+        <w:rPr>
+          <w:color w:val="000000" w:themeColor="text1"/>
+        </w:rPr>
+      </w:pPr>
+      <w:r>
+        <w:rPr>
+          <w:color w:val="000000" w:themeColor="text1"/>
+        </w:rPr>
+        <w:t>Tipo: Nominal</w:t>
+      </w:r>
+    </w:p>
+    <w:p>
+      <w:pPr>
+        <w:pStyle w:val="PargrafodaLista"/>
+        <w:numPr>
+          <w:ilvl w:val="1"/>
+          <w:numId w:val="3"/>
+        </w:numPr>
+        <w:spacing w:after="0" w:line="240" w:lineRule="auto"/>
+        <w:rPr>
+          <w:color w:val="000000" w:themeColor="text1"/>
+        </w:rPr>
+      </w:pPr>
+      <w:r>
+        <w:rPr>
+          <w:color w:val="000000" w:themeColor="text1"/>
+        </w:rPr>
+        <w:t>Valores válidos: CNPJ válido no formato 00.000.000/0000-00</w:t>
+      </w:r>
+    </w:p>
+    <w:p>
+      <w:pPr>
+        <w:pStyle w:val="PargrafodaLista"/>
+        <w:numPr>
+          <w:ilvl w:val="1"/>
+          <w:numId w:val="3"/>
+        </w:numPr>
+        <w:spacing w:after="0" w:line="240" w:lineRule="auto"/>
+        <w:rPr>
+          <w:color w:val="000000" w:themeColor="text1"/>
+        </w:rPr>
+      </w:pPr>
+      <w:r>
+        <w:rPr>
+          <w:color w:val="000000" w:themeColor="text1"/>
+        </w:rPr>
+        <w:t>Valores distintos: 1316</w:t>
+      </w:r>
+    </w:p>
+    <w:p>
+      <w:pPr>
+        <w:pStyle w:val="PargrafodaLista"/>
+        <w:numPr>
+          <w:ilvl w:val="0"/>
+          <w:numId w:val="3"/>
+        </w:numPr>
+        <w:spacing w:after="0" w:line="240" w:lineRule="auto"/>
+        <w:rPr>
+          <w:color w:val="000000" w:themeColor="text1"/>
+        </w:rPr>
+      </w:pPr>
+      <w:r>
+        <w:rPr>
+          <w:color w:val="000000" w:themeColor="text1"/>
+        </w:rPr>
+        <w:t>DEMON_SOCIAL:</w:t>
+      </w:r>
+    </w:p>
+    <w:p>
+      <w:pPr>
+        <w:pStyle w:val="PargrafodaLista"/>
+        <w:numPr>
+          <w:ilvl w:val="1"/>
+          <w:numId w:val="3"/>
+        </w:numPr>
+        <w:spacing w:after="0" w:line="240" w:lineRule="auto"/>
+        <w:rPr>
+          <w:color w:val="000000" w:themeColor="text1"/>
+        </w:rPr>
+      </w:pPr>
+      <w:r>
+        <w:rPr>
+          <w:color w:val="000000" w:themeColor="text1"/>
+        </w:rPr>
+        <w:t>Representa: Razão social da companhia</w:t>
+      </w:r>
+    </w:p>
+    <w:p>
+      <w:pPr>
+        <w:pStyle w:val="PargrafodaLista"/>
+        <w:numPr>
+          <w:ilvl w:val="1"/>
+          <w:numId w:val="3"/>
+        </w:numPr>
+        <w:spacing w:after="0" w:line="240" w:lineRule="auto"/>
+        <w:rPr>
+          <w:color w:val="000000" w:themeColor="text1"/>
+        </w:rPr>
+      </w:pPr>
+      <w:r>
+        <w:rPr>
+          <w:color w:val="000000" w:themeColor="text1"/>
+        </w:rPr>
+        <w:t>Tipo: Nominal</w:t>
+      </w:r>
+    </w:p>
+    <w:p>
+      <w:pPr>
+        <w:pStyle w:val="PargrafodaLista"/>
+        <w:numPr>
+          <w:ilvl w:val="1"/>
+          <w:numId w:val="3"/>
+        </w:numPr>
+        <w:spacing w:after="0" w:line="240" w:lineRule="auto"/>
+        <w:rPr>
+          <w:color w:val="000000" w:themeColor="text1"/>
+        </w:rPr>
+      </w:pPr>
+      <w:r>
+        <w:rPr>
+          <w:color w:val="000000" w:themeColor="text1"/>
+        </w:rPr>
+        <w:t>Valores válidos: Texto</w:t>
+      </w:r>
+    </w:p>
+    <w:p>
+      <w:pPr>
+        <w:pStyle w:val="PargrafodaLista"/>
+        <w:numPr>
+          <w:ilvl w:val="1"/>
+          <w:numId w:val="3"/>
+        </w:numPr>
+        <w:spacing w:after="0" w:line="240" w:lineRule="auto"/>
+        <w:rPr>
+          <w:color w:val="000000" w:themeColor="text1"/>
+        </w:rPr>
+      </w:pPr>
+      <w:r>
+        <w:rPr>
+          <w:color w:val="000000" w:themeColor="text1"/>
+        </w:rPr>
+        <w:t>Valores distintos: 1316</w:t>
+      </w:r>
+    </w:p>
+    <w:p>
+      <w:pPr>
+        <w:pStyle w:val="PargrafodaLista"/>
+        <w:numPr>
+          <w:ilvl w:val="0"/>
+          <w:numId w:val="3"/>
+        </w:numPr>
+        <w:spacing w:after="0" w:line="240" w:lineRule="auto"/>
+        <w:rPr>
+          <w:color w:val="000000" w:themeColor="text1"/>
+        </w:rPr>
+      </w:pPr>
+      <w:r>
+        <w:rPr>
+          <w:color w:val="000000" w:themeColor="text1"/>
+        </w:rPr>
+        <w:t>MUN:</w:t>
+      </w:r>
+    </w:p>
+    <w:p>
+      <w:pPr>
+        <w:pStyle w:val="PargrafodaLista"/>
+        <w:numPr>
+          <w:ilvl w:val="1"/>
+          <w:numId w:val="3"/>
+        </w:numPr>
+        <w:spacing w:after="0" w:line="240" w:lineRule="auto"/>
+        <w:rPr>
+          <w:color w:val="000000" w:themeColor="text1"/>
+        </w:rPr>
+      </w:pPr>
+      <w:r>
+        <w:rPr>
+          <w:color w:val="000000" w:themeColor="text1"/>
+        </w:rPr>
+        <w:t>Representa: Município da sede da companhia</w:t>
+      </w:r>
+    </w:p>
+    <w:p>
+      <w:pPr>
+        <w:pStyle w:val="PargrafodaLista"/>
+        <w:numPr>
+          <w:ilvl w:val="1"/>
+          <w:numId w:val="3"/>
+        </w:numPr>
+        <w:spacing w:after="0" w:line="240" w:lineRule="auto"/>
+        <w:rPr>
+          <w:color w:val="000000" w:themeColor="text1"/>
+        </w:rPr>
+      </w:pPr>
+      <w:r>
+        <w:rPr>
+          <w:color w:val="000000" w:themeColor="text1"/>
+        </w:rPr>
+        <w:t>Tipo: Nominal</w:t>
+      </w:r>
+    </w:p>
+    <w:p>
+      <w:pPr>
+        <w:pStyle w:val="PargrafodaLista"/>
+        <w:numPr>
+          <w:ilvl w:val="1"/>
+          <w:numId w:val="3"/>
+        </w:numPr>
+        <w:spacing w:after="0" w:line="240" w:lineRule="auto"/>
+        <w:rPr>
+          <w:color w:val="000000" w:themeColor="text1"/>
+        </w:rPr>
+      </w:pPr>
+      <w:r>
+        <w:rPr>
+          <w:color w:val="000000" w:themeColor="text1"/>
+        </w:rPr>
+        <w:t>Valores válidos: Texto</w:t>
+      </w:r>
+    </w:p>
+    <w:p>
+      <w:pPr>
+        <w:pStyle w:val="PargrafodaLista"/>
+        <w:numPr>
+          <w:ilvl w:val="1"/>
+          <w:numId w:val="3"/>
+        </w:numPr>
+        <w:spacing w:after="0" w:line="240" w:lineRule="auto"/>
+        <w:rPr>
+          <w:color w:val="000000" w:themeColor="text1"/>
+        </w:rPr>
+      </w:pPr>
+      <w:r>
+        <w:rPr>
+          <w:color w:val="000000" w:themeColor="text1"/>
+        </w:rPr>
+        <w:t xml:space="preserve">Valores distintos: </w:t>
+      </w:r>
+      <w:r>
+        <w:rPr>
+          <w:color w:val="000000" w:themeColor="text1"/>
+        </w:rPr>
+        <w:t>208</w:t>
+      </w:r>
+    </w:p>
+    <w:p>
+      <w:pPr>
+        <w:pStyle w:val="PargrafodaLista"/>
+        <w:numPr>
+          <w:ilvl w:val="0"/>
+          <w:numId w:val="3"/>
+        </w:numPr>
+        <w:spacing w:after="0" w:line="240" w:lineRule="auto"/>
+        <w:rPr>
+          <w:color w:val="000000" w:themeColor="text1"/>
+        </w:rPr>
+      </w:pPr>
+      <w:r>
+        <w:rPr>
+          <w:color w:val="000000" w:themeColor="text1"/>
+        </w:rPr>
+        <w:t>CD_CVM:</w:t>
+      </w:r>
+    </w:p>
+    <w:p>
+      <w:pPr>
+        <w:pStyle w:val="PargrafodaLista"/>
+        <w:numPr>
+          <w:ilvl w:val="1"/>
+          <w:numId w:val="3"/>
+        </w:numPr>
+        <w:spacing w:after="0" w:line="240" w:lineRule="auto"/>
+        <w:rPr>
+          <w:color w:val="000000" w:themeColor="text1"/>
+        </w:rPr>
+      </w:pPr>
+      <w:r>
+        <w:rPr>
+          <w:color w:val="000000" w:themeColor="text1"/>
+        </w:rPr>
+        <w:t>Representa: Código de identificação da CVM</w:t>
+      </w:r>
+    </w:p>
+    <w:p>
+      <w:pPr>
+        <w:pStyle w:val="PargrafodaLista"/>
+        <w:numPr>
+          <w:ilvl w:val="1"/>
+          <w:numId w:val="3"/>
+        </w:numPr>
+        <w:spacing w:after="0" w:line="240" w:lineRule="auto"/>
+        <w:rPr>
+          <w:color w:val="000000" w:themeColor="text1"/>
+        </w:rPr>
+      </w:pPr>
+      <w:r>
+        <w:rPr>
+          <w:color w:val="000000" w:themeColor="text1"/>
+        </w:rPr>
+        <w:t>Tipo: Numérico</w:t>
+      </w:r>
+    </w:p>
+    <w:p>
+      <w:pPr>
+        <w:pStyle w:val="PargrafodaLista"/>
+        <w:numPr>
+          <w:ilvl w:val="1"/>
+          <w:numId w:val="3"/>
+        </w:numPr>
+        <w:spacing w:after="0" w:line="240" w:lineRule="auto"/>
+        <w:rPr>
+          <w:color w:val="000000" w:themeColor="text1"/>
+        </w:rPr>
+      </w:pPr>
+      <w:r>
+        <w:rPr>
+          <w:color w:val="000000" w:themeColor="text1"/>
+        </w:rPr>
+        <w:t>Valores válidos: Número inteiro positivo</w:t>
+      </w:r>
+    </w:p>
+    <w:p>
+      <w:pPr>
+        <w:pStyle w:val="PargrafodaLista"/>
+        <w:numPr>
+          <w:ilvl w:val="1"/>
+          <w:numId w:val="3"/>
+        </w:numPr>
+        <w:spacing w:after="0" w:line="240" w:lineRule="auto"/>
+        <w:rPr>
+          <w:color w:val="000000" w:themeColor="text1"/>
+        </w:rPr>
+      </w:pPr>
+      <w:r>
+        <w:rPr>
+          <w:color w:val="000000" w:themeColor="text1"/>
+        </w:rPr>
+        <w:t>Valores distintos: 1321</w:t>
+      </w:r>
+    </w:p>
+    <w:p>
+      <w:pPr>
+        <w:pStyle w:val="PargrafodaLista"/>
+        <w:numPr>
+          <w:ilvl w:val="0"/>
+          <w:numId w:val="3"/>
+        </w:numPr>
+        <w:spacing w:after="0" w:line="240" w:lineRule="auto"/>
+        <w:rPr>
+          <w:color w:val="000000" w:themeColor="text1"/>
+        </w:rPr>
+      </w:pPr>
+      <w:r>
+        <w:rPr>
+          <w:color w:val="000000" w:themeColor="text1"/>
+        </w:rPr>
+        <w:t>DT_REG:</w:t>
+      </w:r>
+    </w:p>
+    <w:p>
+      <w:pPr>
+        <w:pStyle w:val="PargrafodaLista"/>
+        <w:numPr>
+          <w:ilvl w:val="1"/>
+          <w:numId w:val="3"/>
+        </w:numPr>
+        <w:spacing w:after="0" w:line="240" w:lineRule="auto"/>
+        <w:rPr>
+          <w:color w:val="000000" w:themeColor="text1"/>
+        </w:rPr>
+      </w:pPr>
+      <w:r>
+        <w:rPr>
+          <w:color w:val="000000" w:themeColor="text1"/>
+        </w:rPr>
+        <w:t>Representa: Data registro da companhia na CVM</w:t>
+      </w:r>
+    </w:p>
+    <w:p>
+      <w:pPr>
+        <w:pStyle w:val="PargrafodaLista"/>
+        <w:numPr>
+          <w:ilvl w:val="1"/>
+          <w:numId w:val="3"/>
+        </w:numPr>
+        <w:spacing w:after="0" w:line="240" w:lineRule="auto"/>
+        <w:rPr>
+          <w:color w:val="000000" w:themeColor="text1"/>
+        </w:rPr>
+      </w:pPr>
+      <w:r>
+        <w:rPr>
+          <w:color w:val="000000" w:themeColor="text1"/>
+        </w:rPr>
+        <w:t>Tipo: Data/hora</w:t>
+      </w:r>
+    </w:p>
+    <w:p>
+      <w:pPr>
+        <w:pStyle w:val="PargrafodaLista"/>
+        <w:numPr>
+          <w:ilvl w:val="1"/>
+          <w:numId w:val="3"/>
+        </w:numPr>
+        <w:spacing w:after="0" w:line="240" w:lineRule="auto"/>
+        <w:rPr>
+          <w:color w:val="000000" w:themeColor="text1"/>
+        </w:rPr>
+      </w:pPr>
+      <w:r>
+        <w:rPr>
+          <w:color w:val="000000" w:themeColor="text1"/>
+        </w:rPr>
+        <w:t>Valores válidos: Datas válidas</w:t>
+      </w:r>
+    </w:p>
+    <w:p>
+      <w:pPr>
+        <w:pStyle w:val="PargrafodaLista"/>
+        <w:numPr>
+          <w:ilvl w:val="1"/>
+          <w:numId w:val="3"/>
+        </w:numPr>
+        <w:spacing w:after="0" w:line="240" w:lineRule="auto"/>
+        <w:rPr>
+          <w:color w:val="000000" w:themeColor="text1"/>
+        </w:rPr>
+      </w:pPr>
+      <w:r>
+        <w:rPr>
+          <w:color w:val="000000" w:themeColor="text1"/>
+        </w:rPr>
+        <w:t>Valores distintos: 1071</w:t>
+      </w:r>
+    </w:p>
+    <w:p>
+      <w:pPr>
+        <w:pStyle w:val="PargrafodaLista"/>
+        <w:numPr>
+          <w:ilvl w:val="1"/>
+          <w:numId w:val="3"/>
+        </w:numPr>
+        <w:spacing w:after="0" w:line="240" w:lineRule="auto"/>
+        <w:rPr>
+          <w:color w:val="000000" w:themeColor="text1"/>
+        </w:rPr>
+      </w:pPr>
+      <w:r>
+        <w:rPr>
+          <w:color w:val="000000" w:themeColor="text1"/>
+        </w:rPr>
+        <w:t xml:space="preserve">Menor: </w:t>
+      </w:r>
+      <w:r>
+        <w:rPr>
+          <w:color w:val="000000" w:themeColor="text1"/>
+        </w:rPr>
+        <w:t>1932</w:t>
+      </w:r>
+      <w:r>
+        <w:rPr>
+          <w:color w:val="000000" w:themeColor="text1"/>
+        </w:rPr>
+        <w:t xml:space="preserve">-12-28, Maior: </w:t>
+      </w:r>
+      <w:r>
+        <w:rPr>
+          <w:color w:val="000000" w:themeColor="text1"/>
+        </w:rPr>
+        <w:t>2026</w:t>
+      </w:r>
+      <w:r>
+        <w:rPr>
+          <w:color w:val="000000" w:themeColor="text1"/>
+        </w:rPr>
+        <w:t xml:space="preserve">-06-07, Moda: </w:t>
+      </w:r>
+      <w:r>
+        <w:rPr>
+          <w:color w:val="000000" w:themeColor="text1"/>
+        </w:rPr>
+        <w:t>1977</w:t>
+      </w:r>
+      <w:r>
+        <w:rPr>
+          <w:color w:val="000000" w:themeColor="text1"/>
+        </w:rPr>
+        <w:t xml:space="preserve">-07-20, Mediana: </w:t>
+      </w:r>
+      <w:r>
+        <w:rPr>
+          <w:color w:val="000000" w:themeColor="text1"/>
+        </w:rPr>
+        <w:t>2007</w:t>
+      </w:r>
+      <w:r>
+        <w:rPr>
+          <w:color w:val="000000" w:themeColor="text1"/>
+        </w:rPr>
+        <w:t>-10-10</w:t>
+      </w:r>
+    </w:p>
+    <w:p>
+      <w:pPr>
+        <w:pStyle w:val="PargrafodaLista"/>
+        <w:numPr>
+          <w:ilvl w:val="0"/>
+          <w:numId w:val="3"/>
+        </w:numPr>
+        <w:spacing w:after="0" w:line="240" w:lineRule="auto"/>
+        <w:rPr>
+          <w:color w:val="000000" w:themeColor="text1"/>
+        </w:rPr>
+      </w:pPr>
+      <w:r>
+        <w:rPr>
+          <w:color w:val="000000" w:themeColor="text1"/>
+        </w:rPr>
+        <w:t>DT_INI_SIT:</w:t>
+      </w:r>
+    </w:p>
+    <w:p>
+      <w:pPr>
+        <w:pStyle w:val="PargrafodaLista"/>
+        <w:numPr>
+          <w:ilvl w:val="1"/>
+          <w:numId w:val="3"/>
+        </w:numPr>
+        <w:spacing w:after="0" w:line="240" w:lineRule="auto"/>
+        <w:rPr>
+          <w:color w:val="000000" w:themeColor="text1"/>
+        </w:rPr>
+      </w:pPr>
+      <w:r>
+        <w:rPr>
+          <w:color w:val="000000" w:themeColor="text1"/>
+        </w:rPr>
+        <w:t>Representa: Data de início da situação cadastral atual</w:t>
+      </w:r>
+    </w:p>
+    <w:p>
+      <w:pPr>
+        <w:pStyle w:val="PargrafodaLista"/>
+        <w:numPr>
+          <w:ilvl w:val="1"/>
+          <w:numId w:val="3"/>
+        </w:numPr>
+        <w:spacing w:after="0" w:line="240" w:lineRule="auto"/>
+        <w:rPr>
+          <w:color w:val="000000" w:themeColor="text1"/>
+        </w:rPr>
+      </w:pPr>
+      <w:r>
+        <w:rPr>
+          <w:color w:val="000000" w:themeColor="text1"/>
+        </w:rPr>
+        <w:t>Tipo: Data/hora</w:t>
+      </w:r>
+    </w:p>
+    <w:p>
+      <w:pPr>
+        <w:pStyle w:val="PargrafodaLista"/>
+        <w:numPr>
+          <w:ilvl w:val="1"/>
+          <w:numId w:val="3"/>
+        </w:numPr>
+        <w:spacing w:after="0" w:line="240" w:lineRule="auto"/>
+        <w:rPr>
+          <w:color w:val="000000" w:themeColor="text1"/>
+        </w:rPr>
+      </w:pPr>
+      <w:r>
+        <w:rPr>
+          <w:color w:val="000000" w:themeColor="text1"/>
+        </w:rPr>
+        <w:t>Valores válidos: Datas válidas</w:t>
+      </w:r>
+    </w:p>
+    <w:p>
+      <w:pPr>
+        <w:pStyle w:val="PargrafodaLista"/>
+        <w:numPr>
+          <w:ilvl w:val="1"/>
+          <w:numId w:val="3"/>
+        </w:numPr>
+        <w:spacing w:after="0" w:line="240" w:lineRule="auto"/>
+        <w:rPr>
+          <w:color w:val="000000" w:themeColor="text1"/>
+        </w:rPr>
+      </w:pPr>
+      <w:r>
+        <w:rPr>
+          <w:color w:val="000000" w:themeColor="text1"/>
+        </w:rPr>
+        <w:t>Valores distintos: 996</w:t>
+      </w:r>
+    </w:p>
+    <w:p>
+      <w:pPr>
+        <w:pStyle w:val="PargrafodaLista"/>
+        <w:numPr>
+          <w:ilvl w:val="1"/>
+          <w:numId w:val="3"/>
+        </w:numPr>
+        <w:spacing w:after="0" w:line="240" w:lineRule="auto"/>
+        <w:rPr>
+          <w:color w:val="000000" w:themeColor="text1"/>
+        </w:rPr>
+      </w:pPr>
+      <w:r>
+        <w:rPr>
+          <w:color w:val="000000" w:themeColor="text1"/>
+        </w:rPr>
+        <w:t>Menor: 1938-04-19, Maior: 2026-05-19, Moda: 2010-01-04, Mediana: 2016-01-07</w:t>
+      </w:r>
+    </w:p>
+    <w:p>
+      <w:pPr>
+        <w:pStyle w:val="PargrafodaLista"/>
+        <w:numPr>
+          <w:ilvl w:val="0"/>
+          <w:numId w:val="3"/>
+        </w:numPr>
+        <w:spacing w:after="0" w:line="240" w:lineRule="auto"/>
+        <w:rPr>
+          <w:color w:val="000000" w:themeColor="text1"/>
+        </w:rPr>
+      </w:pPr>
+      <w:r>
+        <w:rPr>
+          <w:color w:val="000000" w:themeColor="text1"/>
+        </w:rPr>
+        <w:t>SETOR_ATIV:</w:t>
+      </w:r>
+    </w:p>
+    <w:p>
+      <w:pPr>
+        <w:pStyle w:val="PargrafodaLista"/>
+        <w:numPr>
+          <w:ilvl w:val="1"/>
+          <w:numId w:val="3"/>
+        </w:numPr>
+        <w:spacing w:after="0" w:line="240" w:lineRule="auto"/>
+        <w:rPr>
+          <w:color w:val="000000" w:themeColor="text1"/>
+        </w:rPr>
+      </w:pPr>
+      <w:r>
+        <w:rPr>
+          <w:color w:val="000000" w:themeColor="text1"/>
+        </w:rPr>
+        <w:t>Representa: Setor de atividade da companhia</w:t>
+      </w:r>
+    </w:p>
+    <w:p>
+      <w:pPr>
+        <w:pStyle w:val="PargrafodaLista"/>
+        <w:numPr>
+          <w:ilvl w:val="1"/>
+          <w:numId w:val="3"/>
+        </w:numPr>
+        <w:spacing w:after="0" w:line="240" w:lineRule="auto"/>
+        <w:rPr>
+          <w:color w:val="000000" w:themeColor="text1"/>
+        </w:rPr>
+      </w:pPr>
+      <w:r>
+        <w:rPr>
+          <w:color w:val="000000" w:themeColor="text1"/>
+        </w:rPr>
+        <w:t>Tipo: Categórico</w:t>
+      </w:r>
+    </w:p>
+    <w:p>
+      <w:pPr>
+        <w:pStyle w:val="PargrafodaLista"/>
+        <w:numPr>
+          <w:ilvl w:val="1"/>
+          <w:numId w:val="3"/>
+        </w:numPr>
+        <w:spacing w:after="0" w:line="240" w:lineRule="auto"/>
+        <w:rPr>
+          <w:color w:val="000000" w:themeColor="text1"/>
+        </w:rPr>
+      </w:pPr>
+      <w:r>
+        <w:rPr>
+          <w:color w:val="000000" w:themeColor="text1"/>
+        </w:rPr>
+        <w:t>Valores válidos: Setores econômicos informados pela CVM</w:t>
+      </w:r>
+    </w:p>
+    <w:p>
+      <w:pPr>
+        <w:pStyle w:val="PargrafodaLista"/>
+        <w:numPr>
+          <w:ilvl w:val="1"/>
+          <w:numId w:val="3"/>
+        </w:numPr>
+        <w:spacing w:after="0" w:line="240" w:lineRule="auto"/>
+        <w:rPr>
+          <w:color w:val="000000" w:themeColor="text1"/>
+        </w:rPr>
+      </w:pPr>
+      <w:r>
+        <w:rPr>
+          <w:color w:val="000000" w:themeColor="text1"/>
+        </w:rPr>
+        <w:t>Valores distintos: 65</w:t>
+      </w:r>
+    </w:p>
+    <w:p>
+      <w:pPr>
+        <w:pStyle w:val="PargrafodaLista"/>
+        <w:numPr>
+          <w:ilvl w:val="0"/>
+          <w:numId w:val="3"/>
+        </w:numPr>
+        <w:spacing w:after="0" w:line="240" w:lineRule="auto"/>
+        <w:rPr>
+          <w:color w:val="000000" w:themeColor="text1"/>
+        </w:rPr>
+      </w:pPr>
+      <w:r>
+        <w:rPr>
+          <w:color w:val="000000" w:themeColor="text1"/>
+        </w:rPr>
+        <w:t>CONTROLE_ACIONARIO:</w:t>
+      </w:r>
+    </w:p>
+    <w:p>
+      <w:pPr>
+        <w:pStyle w:val="PargrafodaLista"/>
+        <w:numPr>
+          <w:ilvl w:val="1"/>
+          <w:numId w:val="3"/>
+        </w:numPr>
+        <w:spacing w:after="0" w:line="240" w:lineRule="auto"/>
+        <w:rPr>
+          <w:color w:val="000000" w:themeColor="text1"/>
+        </w:rPr>
+      </w:pPr>
+      <w:r>
+        <w:rPr>
+          <w:color w:val="000000" w:themeColor="text1"/>
+        </w:rPr>
+        <w:t>Representa: Tipo de controle acionário</w:t>
+      </w:r>
+    </w:p>
+    <w:p>
+      <w:pPr>
+        <w:pStyle w:val="PargrafodaLista"/>
+        <w:numPr>
+          <w:ilvl w:val="1"/>
+          <w:numId w:val="3"/>
+        </w:numPr>
+        <w:spacing w:after="0" w:line="240" w:lineRule="auto"/>
+        <w:rPr>
+          <w:color w:val="000000" w:themeColor="text1"/>
+        </w:rPr>
+      </w:pPr>
+      <w:r>
+        <w:rPr>
+          <w:color w:val="000000" w:themeColor="text1"/>
+        </w:rPr>
+        <w:t>Tipo: Categórico</w:t>
+      </w:r>
+    </w:p>
+    <w:p>
+      <w:pPr>
+        <w:pStyle w:val="PargrafodaLista"/>
+        <w:numPr>
+          <w:ilvl w:val="1"/>
+          <w:numId w:val="3"/>
+        </w:numPr>
+        <w:spacing w:after="0" w:line="240" w:lineRule="auto"/>
+        <w:rPr>
+          <w:color w:val="000000" w:themeColor="text1"/>
+        </w:rPr>
+      </w:pPr>
+      <w:r>
+        <w:rPr>
+          <w:color w:val="000000" w:themeColor="text1"/>
+        </w:rPr>
+        <w:t xml:space="preserve">Valores válidos: </w:t>
+      </w:r>
+      <w:r>
+        <w:rPr>
+          <w:color w:val="000000" w:themeColor="text1"/>
+        </w:rPr>
+        <w:t>ESTATAL</w:t>
+      </w:r>
+      <w:r>
+        <w:rPr>
+          <w:color w:val="000000" w:themeColor="text1"/>
+        </w:rPr>
+        <w:t xml:space="preserve">, </w:t>
+      </w:r>
+      <w:r>
+        <w:rPr>
+          <w:color w:val="000000" w:themeColor="text1"/>
+        </w:rPr>
+        <w:t>ESTATAL HOLDING</w:t>
+      </w:r>
+      <w:r>
+        <w:rPr>
+          <w:color w:val="000000" w:themeColor="text1"/>
+        </w:rPr>
+        <w:t xml:space="preserve">, </w:t>
+      </w:r>
+      <w:r>
+        <w:rPr>
+          <w:color w:val="000000" w:themeColor="text1"/>
+        </w:rPr>
+        <w:t>ESTRANGEIRO</w:t>
+      </w:r>
+      <w:r>
+        <w:rPr>
+          <w:color w:val="000000" w:themeColor="text1"/>
+        </w:rPr>
+        <w:t xml:space="preserve">, </w:t>
+      </w:r>
+      <w:r>
+        <w:rPr>
+          <w:color w:val="000000" w:themeColor="text1"/>
+        </w:rPr>
+        <w:t>ESTRANGEIRO HOLDING</w:t>
+      </w:r>
+      <w:r>
+        <w:rPr>
+          <w:color w:val="000000" w:themeColor="text1"/>
+        </w:rPr>
+        <w:t xml:space="preserve">, </w:t>
+      </w:r>
+      <w:r>
+        <w:rPr>
+          <w:color w:val="000000" w:themeColor="text1"/>
+        </w:rPr>
+        <w:t>PRIVADO</w:t>
+      </w:r>
+      <w:r>
+        <w:rPr>
+          <w:color w:val="000000" w:themeColor="text1"/>
+        </w:rPr>
+        <w:t xml:space="preserve">, </w:t>
+      </w:r>
+      <w:r>
+        <w:rPr>
+          <w:color w:val="000000" w:themeColor="text1"/>
+        </w:rPr>
+        <w:t>PRIVADO HOLDING</w:t>
+      </w:r>
+    </w:p>
+    <w:p>
+      <w:pPr>
+        <w:pStyle w:val="PargrafodaLista"/>
+        <w:numPr>
+          <w:ilvl w:val="1"/>
+          <w:numId w:val="3"/>
+        </w:numPr>
+        <w:spacing w:after="0" w:line="240" w:lineRule="auto"/>
+        <w:rPr>
+          <w:color w:val="000000" w:themeColor="text1"/>
+        </w:rPr>
+      </w:pPr>
+      <w:r>
+        <w:rPr>
+          <w:color w:val="000000" w:themeColor="text1"/>
+        </w:rPr>
+        <w:t>Valores distintos: 6</w:t>
+      </w:r>
+    </w:p>
+    <w:p>
+      <w:pPr>
+        <w:pStyle w:val="PargrafodaLista"/>
+        <w:numPr>
+          <w:ilvl w:val="0"/>
+          <w:numId w:val="3"/>
+        </w:numPr>
+        <w:spacing w:after="0" w:line="240" w:lineRule="auto"/>
+        <w:rPr>
+          <w:color w:val="000000" w:themeColor="text1"/>
+        </w:rPr>
+      </w:pPr>
+      <w:r>
+        <w:rPr>
+          <w:color w:val="000000" w:themeColor="text1"/>
+        </w:rPr>
+        <w:lastRenderedPageBreak/>
+        <w:t>TP_ENDER:</w:t>
+      </w:r>
+    </w:p>
+    <w:p>
+      <w:pPr>
+        <w:pStyle w:val="PargrafodaLista"/>
+        <w:numPr>
+          <w:ilvl w:val="1"/>
+          <w:numId w:val="3"/>
+        </w:numPr>
+        <w:spacing w:after="0" w:line="240" w:lineRule="auto"/>
+        <w:rPr>
+          <w:color w:val="000000" w:themeColor="text1"/>
+        </w:rPr>
+      </w:pPr>
+      <w:r>
+        <w:rPr>
+          <w:color w:val="000000" w:themeColor="text1"/>
+        </w:rPr>
+        <w:t>Representa: Tipo de endereço cadastrado</w:t>
+      </w:r>
+    </w:p>
+    <w:p>
+      <w:pPr>
+        <w:pStyle w:val="PargrafodaLista"/>
+        <w:numPr>
+          <w:ilvl w:val="1"/>
+          <w:numId w:val="3"/>
+        </w:numPr>
+        <w:spacing w:after="0" w:line="240" w:lineRule="auto"/>
+        <w:rPr>
+          <w:color w:val="000000" w:themeColor="text1"/>
+        </w:rPr>
+      </w:pPr>
+      <w:r>
+        <w:rPr>
+          <w:color w:val="000000" w:themeColor="text1"/>
+        </w:rPr>
+        <w:t>Tipo: Categórico</w:t>
+      </w:r>
+    </w:p>
+    <w:p>
+      <w:pPr>
+        <w:pStyle w:val="PargrafodaLista"/>
+        <w:numPr>
+          <w:ilvl w:val="1"/>
+          <w:numId w:val="3"/>
+        </w:numPr>
+        <w:spacing w:after="0" w:line="240" w:lineRule="auto"/>
+        <w:rPr>
+          <w:color w:val="000000" w:themeColor="text1"/>
+        </w:rPr>
+      </w:pPr>
+      <w:r>
+        <w:rPr>
+          <w:color w:val="000000" w:themeColor="text1"/>
+        </w:rPr>
+        <w:t>Valores válidos: SEDE</w:t>
+      </w:r>
+    </w:p>
+    <w:p>
+      <w:pPr>
+        <w:pStyle w:val="PargrafodaLista"/>
+        <w:numPr>
+          <w:ilvl w:val="1"/>
+          <w:numId w:val="3"/>
+        </w:numPr>
+        <w:spacing w:after="0" w:line="240" w:lineRule="auto"/>
+        <w:rPr>
+          <w:color w:val="000000" w:themeColor="text1"/>
+        </w:rPr>
+      </w:pPr>
+      <w:r>
+        <w:rPr>
+          <w:color w:val="000000" w:themeColor="text1"/>
+        </w:rPr>
+        <w:t>Valores distintos: 1</w:t>
+      </w:r>
+    </w:p>
+    <w:p>
+      <w:pPr>
+        <w:pStyle w:val="PargrafodaLista"/>
+        <w:numPr>
+          <w:ilvl w:val="0"/>
+          <w:numId w:val="3"/>
+        </w:numPr>
+        <w:spacing w:after="0" w:line="240" w:lineRule="auto"/>
+        <w:rPr>
+          <w:color w:val="000000" w:themeColor="text1"/>
+        </w:rPr>
+      </w:pPr>
+      <w:r>
+        <w:rPr>
+          <w:color w:val="000000" w:themeColor="text1"/>
+        </w:rPr>
+        <w:t>UF:</w:t>
+      </w:r>
+    </w:p>
+    <w:p>
+      <w:pPr>
+        <w:pStyle w:val="PargrafodaLista"/>
+        <w:numPr>
+          <w:ilvl w:val="1"/>
+          <w:numId w:val="3"/>
+        </w:numPr>
+        <w:spacing w:after="0" w:line="240" w:lineRule="auto"/>
+        <w:rPr>
+          <w:color w:val="000000" w:themeColor="text1"/>
+        </w:rPr>
+      </w:pPr>
+      <w:r>
+        <w:rPr>
+          <w:color w:val="000000" w:themeColor="text1"/>
+        </w:rPr>
+        <w:t>Representa: Unidade federativa da sede</w:t>
+      </w:r>
+    </w:p>
+    <w:p>
+      <w:pPr>
+        <w:pStyle w:val="PargrafodaLista"/>
+        <w:numPr>
+          <w:ilvl w:val="1"/>
+          <w:numId w:val="3"/>
+        </w:numPr>
+        <w:spacing w:after="0" w:line="240" w:lineRule="auto"/>
+        <w:rPr>
+          <w:color w:val="000000" w:themeColor="text1"/>
+        </w:rPr>
+      </w:pPr>
+      <w:r>
+        <w:rPr>
+          <w:color w:val="000000" w:themeColor="text1"/>
+        </w:rPr>
+        <w:t>Tipo: Nominal</w:t>
+      </w:r>
+    </w:p>
+    <w:p>
+      <w:pPr>
+        <w:pStyle w:val="PargrafodaLista"/>
+        <w:numPr>
+          <w:ilvl w:val="1"/>
+          <w:numId w:val="3"/>
+        </w:numPr>
+        <w:spacing w:after="0" w:line="240" w:lineRule="auto"/>
+        <w:rPr>
+          <w:color w:val="000000" w:themeColor="text1"/>
+        </w:rPr>
+      </w:pPr>
+      <w:r>
+        <w:rPr>
+          <w:color w:val="000000" w:themeColor="text1"/>
+        </w:rPr>
+        <w:t>Valores válidos: Siglas de UF brasileiros</w:t>
+      </w:r>
+    </w:p>
+    <w:p>
+      <w:pPr>
+        <w:pStyle w:val="PargrafodaLista"/>
+        <w:numPr>
+          <w:ilvl w:val="1"/>
+          <w:numId w:val="3"/>
+        </w:numPr>
+        <w:spacing w:after="0" w:line="240" w:lineRule="auto"/>
+        <w:rPr>
+          <w:color w:val="000000" w:themeColor="text1"/>
+        </w:rPr>
+      </w:pPr>
+      <w:r>
+        <w:rPr>
+          <w:color w:val="000000" w:themeColor="text1"/>
+        </w:rPr>
+        <w:t>Valores distintos: 24</w:t>
+      </w:r>
+    </w:p>
+    <w:p>
+      <w:pPr>
+        <w:pStyle w:val="PargrafodaLista"/>
+        <w:numPr>
+          <w:ilvl w:val="0"/>
+          <w:numId w:val="3"/>
+        </w:numPr>
+        <w:spacing w:after="0" w:line="240" w:lineRule="auto"/>
+        <w:rPr>
+          <w:color w:val="000000" w:themeColor="text1"/>
+        </w:rPr>
+      </w:pPr>
+      <w:r>
+        <w:rPr>
+          <w:color w:val="000000" w:themeColor="text1"/>
+        </w:rPr>
+        <w:t>CATEG_REG:</w:t>
+      </w:r>
+    </w:p>
+    <w:p>
+      <w:pPr>
+        <w:pStyle w:val="PargrafodaLista"/>
+        <w:numPr>
+          <w:ilvl w:val="1"/>
+          <w:numId w:val="3"/>
+        </w:numPr>
+        <w:spacing w:after="0" w:line="240" w:lineRule="auto"/>
+        <w:rPr>
+          <w:color w:val="000000" w:themeColor="text1"/>
+        </w:rPr>
+      </w:pPr>
+      <w:r>
+        <w:rPr>
+          <w:color w:val="000000" w:themeColor="text1"/>
+        </w:rPr>
+        <w:t>Representa: Categoria de registro da companhia na CVM</w:t>
+      </w:r>
+    </w:p>
+    <w:p>
+      <w:pPr>
+        <w:pStyle w:val="PargrafodaLista"/>
+        <w:numPr>
+          <w:ilvl w:val="1"/>
+          <w:numId w:val="3"/>
+        </w:numPr>
+        <w:spacing w:after="0" w:line="240" w:lineRule="auto"/>
+        <w:rPr>
+          <w:color w:val="000000" w:themeColor="text1"/>
+        </w:rPr>
+      </w:pPr>
+      <w:r>
+        <w:rPr>
+          <w:color w:val="000000" w:themeColor="text1"/>
+        </w:rPr>
+        <w:t>Tipo: Categórico</w:t>
+      </w:r>
+    </w:p>
+    <w:p>
+      <w:pPr>
+        <w:pStyle w:val="PargrafodaLista"/>
+        <w:numPr>
+          <w:ilvl w:val="1"/>
+          <w:numId w:val="3"/>
+        </w:numPr>
+        <w:spacing w:after="0" w:line="240" w:lineRule="auto"/>
+        <w:rPr>
+          <w:color w:val="000000" w:themeColor="text1"/>
+        </w:rPr>
+      </w:pPr>
+      <w:r>
+        <w:rPr>
+          <w:color w:val="000000" w:themeColor="text1"/>
+        </w:rPr>
+        <w:t>Valores válidos: Categoria A, Categoria B</w:t>
+      </w:r>
+    </w:p>
+    <w:p>
+      <w:pPr>
         <w:keepNext/>
         <w:spacing w:after="0" w:line="240" w:lineRule="auto"/>
         <w:jc w:val="center"/>
@@ -721,11 +2014,10 @@
           <w:noProof/>
           <w:color w:val="000000" w:themeColor="text1"/>
         </w:rPr>
-        <w:lastRenderedPageBreak/>
         <w:drawing>
-          <wp:inline distT="0" distB="0" distL="0" distR="0" wp14:anchorId="7FA8AFBC" wp14:editId="75EA8622">
-            <wp:extent cx="5249753" cy="3402281"/>
-            <wp:effectExtent l="0" t="0" r="8255" b="8255"/>
+          <wp:inline distT="0" distB="0" distL="0" distR="0" wp14:anchorId="7FA8AFBC" wp14:editId="37D07776">
+            <wp:extent cx="3841668" cy="2489724"/>
+            <wp:effectExtent l="0" t="0" r="6985" b="6350"/>
             <wp:docPr id="1263821426" name="Imagem 1"/>
             <wp:cNvGraphicFramePr>
               <a:graphicFrameLocks xmlns:a="http://schemas.openxmlformats.org/drawingml/2006/main" noChangeAspect="1"/>
@@ -738,7 +2030,7 @@
                     <pic:cNvPicPr/>
                   </pic:nvPicPr>
                   <pic:blipFill>
-                    <a:blip r:embed="rId11"/>
+                    <a:blip r:embed="rId13"/>
                     <a:stretch>
                       <a:fillRect/>
                     </a:stretch>
@@ -746,7 +2038,7 @@
                   <pic:spPr>
                     <a:xfrm>
                       <a:off x="0" y="0"/>
-                      <a:ext cx="5307601" cy="3439771"/>
+                      <a:ext cx="3903895" cy="2530052"/>
                     </a:xfrm>
                     <a:prstGeom prst="rect">
                       <a:avLst/>
@@ -766,14 +2058,27 @@
       <w:r>
         <w:t xml:space="preserve">Figura </w:t>
       </w:r>
-      <w:fldSimple w:instr=" SEQ Figura \* ARABIC ">
-        <w:r>
-          <w:rPr>
-            <w:noProof/>
-          </w:rPr>
-          <w:t>1</w:t>
-        </w:r>
-      </w:fldSimple>
+      <w:r>
+        <w:fldChar w:fldCharType="begin"/>
+      </w:r>
+      <w:r>
+        <w:instrText xml:space="preserve"> SEQ Figura \* ARABIC </w:instrText>
+      </w:r>
+      <w:r>
+        <w:fldChar w:fldCharType="separate"/>
+      </w:r>
+      <w:r>
+        <w:rPr>
+          <w:noProof/>
+        </w:rPr>
+        <w:t>1</w:t>
+      </w:r>
+      <w:r>
+        <w:rPr>
+          <w:noProof/>
+        </w:rPr>
+        <w:fldChar w:fldCharType="end"/>
+      </w:r>
       <w:r>
         <w:t xml:space="preserve">. Fluxo montado no Orange para importação, seleção, filtragem, estatísticas, </w:t>
       </w:r>
@@ -810,7 +2115,7 @@
                     <pic:cNvPicPr/>
                   </pic:nvPicPr>
                   <pic:blipFill>
-                    <a:blip r:embed="rId12"/>
+                    <a:blip r:embed="rId14"/>
                     <a:stretch>
                       <a:fillRect/>
                     </a:stretch>
@@ -839,14 +2144,27 @@
       <w:r>
         <w:t xml:space="preserve">Figura </w:t>
       </w:r>
-      <w:fldSimple w:instr=" SEQ Figura \* ARABIC ">
-        <w:r>
-          <w:rPr>
-            <w:noProof/>
-          </w:rPr>
-          <w:t>2</w:t>
-        </w:r>
-      </w:fldSimple>
+      <w:r>
+        <w:fldChar w:fldCharType="begin"/>
+      </w:r>
+      <w:r>
+        <w:instrText xml:space="preserve"> SEQ Figura \* ARABIC </w:instrText>
+      </w:r>
+      <w:r>
+        <w:fldChar w:fldCharType="separate"/>
+      </w:r>
+      <w:r>
+        <w:rPr>
+          <w:noProof/>
+        </w:rPr>
+        <w:t>2</w:t>
+      </w:r>
+      <w:r>
+        <w:rPr>
+          <w:noProof/>
+        </w:rPr>
+        <w:fldChar w:fldCharType="end"/>
+      </w:r>
       <w:r>
         <w:t>. Informações gerais do conjunto de dados selecionado</w:t>
       </w:r>
@@ -877,7 +2195,7 @@
                     <pic:cNvPicPr/>
                   </pic:nvPicPr>
                   <pic:blipFill>
-                    <a:blip r:embed="rId13"/>
+                    <a:blip r:embed="rId15"/>
                     <a:stretch>
                       <a:fillRect/>
                     </a:stretch>
@@ -906,14 +2224,27 @@
       <w:r>
         <w:t xml:space="preserve">Figura </w:t>
       </w:r>
-      <w:fldSimple w:instr=" SEQ Figura \* ARABIC ">
-        <w:r>
-          <w:rPr>
-            <w:noProof/>
-          </w:rPr>
-          <w:t>3</w:t>
-        </w:r>
-      </w:fldSimple>
+      <w:r>
+        <w:fldChar w:fldCharType="begin"/>
+      </w:r>
+      <w:r>
+        <w:instrText xml:space="preserve"> SEQ Figura \* ARABIC </w:instrText>
+      </w:r>
+      <w:r>
+        <w:fldChar w:fldCharType="separate"/>
+      </w:r>
+      <w:r>
+        <w:rPr>
+          <w:noProof/>
+        </w:rPr>
+        <w:t>3</w:t>
+      </w:r>
+      <w:r>
+        <w:rPr>
+          <w:noProof/>
+        </w:rPr>
+        <w:fldChar w:fldCharType="end"/>
+      </w:r>
       <w:r>
         <w:t>. Seleção das colunas utilizadas e definição da coluna alvo SIT</w:t>
       </w:r>
@@ -943,7 +2274,7 @@
                     <pic:cNvPicPr/>
                   </pic:nvPicPr>
                   <pic:blipFill>
-                    <a:blip r:embed="rId14"/>
+                    <a:blip r:embed="rId16"/>
                     <a:stretch>
                       <a:fillRect/>
                     </a:stretch>
@@ -972,14 +2303,27 @@
       <w:r>
         <w:t xml:space="preserve">Figura </w:t>
       </w:r>
-      <w:fldSimple w:instr=" SEQ Figura \* ARABIC ">
-        <w:r>
-          <w:rPr>
-            <w:noProof/>
-          </w:rPr>
-          <w:t>4</w:t>
-        </w:r>
-      </w:fldSimple>
+      <w:r>
+        <w:fldChar w:fldCharType="begin"/>
+      </w:r>
+      <w:r>
+        <w:instrText xml:space="preserve"> SEQ Figura \* ARABIC </w:instrText>
+      </w:r>
+      <w:r>
+        <w:fldChar w:fldCharType="separate"/>
+      </w:r>
+      <w:r>
+        <w:rPr>
+          <w:noProof/>
+        </w:rPr>
+        <w:t>4</w:t>
+      </w:r>
+      <w:r>
+        <w:rPr>
+          <w:noProof/>
+        </w:rPr>
+        <w:fldChar w:fldCharType="end"/>
+      </w:r>
       <w:r>
         <w:t>. Filtros aplicados para remover registros com valores faltantes nas colunas escolhidas</w:t>
       </w:r>
@@ -1010,7 +2354,7 @@
                     <pic:cNvPicPr/>
                   </pic:nvPicPr>
                   <pic:blipFill>
-                    <a:blip r:embed="rId15"/>
+                    <a:blip r:embed="rId17"/>
                     <a:stretch>
                       <a:fillRect/>
                     </a:stretch>
@@ -1039,14 +2383,27 @@
       <w:r>
         <w:t xml:space="preserve">Figura </w:t>
       </w:r>
-      <w:fldSimple w:instr=" SEQ Figura \* ARABIC ">
-        <w:r>
-          <w:rPr>
-            <w:noProof/>
-          </w:rPr>
-          <w:t>5</w:t>
-        </w:r>
-      </w:fldSimple>
+      <w:r>
+        <w:fldChar w:fldCharType="begin"/>
+      </w:r>
+      <w:r>
+        <w:instrText xml:space="preserve"> SEQ Figura \* ARABIC </w:instrText>
+      </w:r>
+      <w:r>
+        <w:fldChar w:fldCharType="separate"/>
+      </w:r>
+      <w:r>
+        <w:rPr>
+          <w:noProof/>
+        </w:rPr>
+        <w:t>5</w:t>
+      </w:r>
+      <w:r>
+        <w:rPr>
+          <w:noProof/>
+        </w:rPr>
+        <w:fldChar w:fldCharType="end"/>
+      </w:r>
       <w:r>
         <w:t>. Estatísticas das colunas selecionadas, evidenciando ausência de valores faltantes</w:t>
       </w:r>
@@ -1076,7 +2433,7 @@
                     <pic:cNvPicPr/>
                   </pic:nvPicPr>
                   <pic:blipFill>
-                    <a:blip r:embed="rId16"/>
+                    <a:blip r:embed="rId18"/>
                     <a:stretch>
                       <a:fillRect/>
                     </a:stretch>
@@ -1105,14 +2462,27 @@
       <w:r>
         <w:t xml:space="preserve">Figura </w:t>
       </w:r>
-      <w:fldSimple w:instr=" SEQ Figura \* ARABIC ">
-        <w:r>
-          <w:rPr>
-            <w:noProof/>
-          </w:rPr>
-          <w:t>6</w:t>
-        </w:r>
-      </w:fldSimple>
+      <w:r>
+        <w:fldChar w:fldCharType="begin"/>
+      </w:r>
+      <w:r>
+        <w:instrText xml:space="preserve"> SEQ Figura \* ARABIC </w:instrText>
+      </w:r>
+      <w:r>
+        <w:fldChar w:fldCharType="separate"/>
+      </w:r>
+      <w:r>
+        <w:rPr>
+          <w:noProof/>
+        </w:rPr>
+        <w:t>6</w:t>
+      </w:r>
+      <w:r>
+        <w:rPr>
+          <w:noProof/>
+        </w:rPr>
+        <w:fldChar w:fldCharType="end"/>
+      </w:r>
       <w:r>
         <w:t>. Visualização final do conjunto de dados preparado</w:t>
       </w:r>
@@ -1132,8 +2502,6 @@
           <w:szCs w:val="22"/>
         </w:rPr>
         <w:sectPr>
-          <w:headerReference w:type="default" r:id="rId17"/>
-          <w:footerReference w:type="default" r:id="rId18"/>
           <w:pgSz w:w="11906" w:h="16838"/>
           <w:pgMar w:top="1418" w:right="1418" w:bottom="1418" w:left="1418" w:header="709" w:footer="794" w:gutter="0"/>
           <w:cols w:space="708"/>
@@ -1580,7 +2948,7 @@
             </wp:anchor>
           </w:drawing>
         </mc:Choice>
-        <mc:Fallback xmlns:a14="http://schemas.microsoft.com/office/drawing/2010/main" xmlns:a="http://schemas.openxmlformats.org/drawingml/2006/main">
+        <mc:Fallback xmlns:a="http://schemas.openxmlformats.org/drawingml/2006/main" xmlns:a14="http://schemas.microsoft.com/office/drawing/2010/main">
           <w:pict>
             <v:shapetype id="_x0000_t32" coordsize="21600,21600" o:oned="t" filled="f" o:spt="32" path="m,l21600,21600e" w14:anchorId="16A5FEA1">
               <v:path fillok="f" arrowok="t" o:connecttype="none"/>
@@ -1842,6 +3210,98 @@
     </w:lvl>
   </w:abstractNum>
   <w:abstractNum w:abstractNumId="1" w15:restartNumberingAfterBreak="0">
+    <w:nsid w:val="342946A9"/>
+    <w:multiLevelType w:val="hybridMultilevel"/>
+    <w:tmpl w:val="EAC89292"/>
+    <w:lvl w:ilvl="0" w:tplc="04160011">
+      <w:start w:val="1"/>
+      <w:numFmt w:val="decimal"/>
+      <w:lvlText w:val="%1)"/>
+      <w:lvlJc w:val="left"/>
+      <w:pPr>
+        <w:ind w:left="720" w:hanging="360"/>
+      </w:pPr>
+      <w:rPr>
+        <w:rFonts w:hint="default"/>
+      </w:rPr>
+    </w:lvl>
+    <w:lvl w:ilvl="1" w:tplc="04160001">
+      <w:start w:val="1"/>
+      <w:numFmt w:val="bullet"/>
+      <w:lvlText w:val=""/>
+      <w:lvlJc w:val="left"/>
+      <w:pPr>
+        <w:ind w:left="1440" w:hanging="360"/>
+      </w:pPr>
+      <w:rPr>
+        <w:rFonts w:ascii="Symbol" w:hAnsi="Symbol" w:hint="default"/>
+      </w:rPr>
+    </w:lvl>
+    <w:lvl w:ilvl="2" w:tplc="0416001B" w:tentative="1">
+      <w:start w:val="1"/>
+      <w:numFmt w:val="lowerRoman"/>
+      <w:lvlText w:val="%3."/>
+      <w:lvlJc w:val="right"/>
+      <w:pPr>
+        <w:ind w:left="2160" w:hanging="180"/>
+      </w:pPr>
+    </w:lvl>
+    <w:lvl w:ilvl="3" w:tplc="0416000F" w:tentative="1">
+      <w:start w:val="1"/>
+      <w:numFmt w:val="decimal"/>
+      <w:lvlText w:val="%4."/>
+      <w:lvlJc w:val="left"/>
+      <w:pPr>
+        <w:ind w:left="2880" w:hanging="360"/>
+      </w:pPr>
+    </w:lvl>
+    <w:lvl w:ilvl="4" w:tplc="04160019" w:tentative="1">
+      <w:start w:val="1"/>
+      <w:numFmt w:val="lowerLetter"/>
+      <w:lvlText w:val="%5."/>
+      <w:lvlJc w:val="left"/>
+      <w:pPr>
+        <w:ind w:left="3600" w:hanging="360"/>
+      </w:pPr>
+    </w:lvl>
+    <w:lvl w:ilvl="5" w:tplc="0416001B" w:tentative="1">
+      <w:start w:val="1"/>
+      <w:numFmt w:val="lowerRoman"/>
+      <w:lvlText w:val="%6."/>
+      <w:lvlJc w:val="right"/>
+      <w:pPr>
+        <w:ind w:left="4320" w:hanging="180"/>
+      </w:pPr>
+    </w:lvl>
+    <w:lvl w:ilvl="6" w:tplc="0416000F" w:tentative="1">
+      <w:start w:val="1"/>
+      <w:numFmt w:val="decimal"/>
+      <w:lvlText w:val="%7."/>
+      <w:lvlJc w:val="left"/>
+      <w:pPr>
+        <w:ind w:left="5040" w:hanging="360"/>
+      </w:pPr>
+    </w:lvl>
+    <w:lvl w:ilvl="7" w:tplc="04160019" w:tentative="1">
+      <w:start w:val="1"/>
+      <w:numFmt w:val="lowerLetter"/>
+      <w:lvlText w:val="%8."/>
+      <w:lvlJc w:val="left"/>
+      <w:pPr>
+        <w:ind w:left="5760" w:hanging="360"/>
+      </w:pPr>
+    </w:lvl>
+    <w:lvl w:ilvl="8" w:tplc="0416001B" w:tentative="1">
+      <w:start w:val="1"/>
+      <w:numFmt w:val="lowerRoman"/>
+      <w:lvlText w:val="%9."/>
+      <w:lvlJc w:val="right"/>
+      <w:pPr>
+        <w:ind w:left="6480" w:hanging="180"/>
+      </w:pPr>
+    </w:lvl>
+  </w:abstractNum>
+  <w:abstractNum w:abstractNumId="2" w15:restartNumberingAfterBreak="0">
     <w:nsid w:val="3CD56DB8"/>
     <w:multiLevelType w:val="hybridMultilevel"/>
     <w:tmpl w:val="90A44EA4"/>
@@ -1955,10 +3415,13 @@
     </w:lvl>
   </w:abstractNum>
   <w:num w:numId="1" w16cid:durableId="1254242026">
-    <w:abstractNumId w:val="1"/>
+    <w:abstractNumId w:val="2"/>
   </w:num>
   <w:num w:numId="2" w16cid:durableId="1915621580">
     <w:abstractNumId w:val="0"/>
+  </w:num>
+  <w:num w:numId="3" w16cid:durableId="441996192">
+    <w:abstractNumId w:val="1"/>
   </w:num>
 </w:numbering>
 </file>
@@ -2361,7 +3824,7 @@
   <w:style w:type="paragraph" w:default="1" w:styleId="Normal">
     <w:name w:val="Normal"/>
     <w:qFormat/>
-    <w:rsid w:val="00751CAB"/>
+    <w:rsid w:val="000A3D9A"/>
   </w:style>
   <w:style w:type="character" w:default="1" w:styleId="Fontepargpadro">
     <w:name w:val="Default Paragraph Font"/>
@@ -2936,7 +4399,12 @@
 </file>
 
 <file path=customXml/item2.xml><?xml version="1.0" encoding="utf-8"?>
-<b:Sources xmlns:b="http://schemas.openxmlformats.org/officeDocument/2006/bibliography" xmlns="http://schemas.openxmlformats.org/officeDocument/2006/bibliography" SelectedStyle="\APASixthEditionOfficeOnline.xsl" StyleName="APA" Version="6"/>
+<?mso-contentType ?>
+<FormTemplates xmlns="http://schemas.microsoft.com/sharepoint/v3/contenttype/forms">
+  <Display>DocumentLibraryForm</Display>
+  <Edit>DocumentLibraryForm</Edit>
+  <New>DocumentLibraryForm</New>
+</FormTemplates>
 </file>
 
 <file path=customXml/item3.xml><?xml version="1.0" encoding="utf-8"?>
@@ -3183,12 +4651,7 @@
 </file>
 
 <file path=customXml/item4.xml><?xml version="1.0" encoding="utf-8"?>
-<?mso-contentType ?>
-<FormTemplates xmlns="http://schemas.microsoft.com/sharepoint/v3/contenttype/forms">
-  <Display>DocumentLibraryForm</Display>
-  <Edit>DocumentLibraryForm</Edit>
-  <New>DocumentLibraryForm</New>
-</FormTemplates>
+<b:Sources xmlns:b="http://schemas.openxmlformats.org/officeDocument/2006/bibliography" xmlns="http://schemas.openxmlformats.org/officeDocument/2006/bibliography" SelectedStyle="\APASixthEditionOfficeOnline.xsl" StyleName="APA" Version="6"/>
 </file>
 
 <file path=customXml/itemProps1.xml><?xml version="1.0" encoding="utf-8"?>
@@ -3203,9 +4666,9 @@
 </file>
 
 <file path=customXml/itemProps2.xml><?xml version="1.0" encoding="utf-8"?>
-<ds:datastoreItem xmlns:ds="http://schemas.openxmlformats.org/officeDocument/2006/customXml" ds:itemID="{EA393952-33A7-41FA-8155-0355CE495BA2}">
+<ds:datastoreItem xmlns:ds="http://schemas.openxmlformats.org/officeDocument/2006/customXml" ds:itemID="{0593B9FC-456C-46BA-ABE7-4E86A6CE6864}">
   <ds:schemaRefs>
-    <ds:schemaRef ds:uri="http://schemas.openxmlformats.org/officeDocument/2006/bibliography"/>
+    <ds:schemaRef ds:uri="http://schemas.microsoft.com/sharepoint/v3/contenttype/forms"/>
   </ds:schemaRefs>
 </ds:datastoreItem>
 </file>
@@ -3230,9 +4693,9 @@
 </file>
 
 <file path=customXml/itemProps4.xml><?xml version="1.0" encoding="utf-8"?>
-<ds:datastoreItem xmlns:ds="http://schemas.openxmlformats.org/officeDocument/2006/customXml" ds:itemID="{0593B9FC-456C-46BA-ABE7-4E86A6CE6864}">
+<ds:datastoreItem xmlns:ds="http://schemas.openxmlformats.org/officeDocument/2006/customXml" ds:itemID="{EA393952-33A7-41FA-8155-0355CE495BA2}">
   <ds:schemaRefs>
-    <ds:schemaRef ds:uri="http://schemas.microsoft.com/sharepoint/v3/contenttype/forms"/>
+    <ds:schemaRef ds:uri="http://schemas.openxmlformats.org/officeDocument/2006/bibliography"/>
   </ds:schemaRefs>
 </ds:datastoreItem>
 </file>
</xml_diff>